<commit_message>
court(bap1) reply-brief docx: Liberation Serif (DEF-FONT-002), related-cases boxes as bordered runs; docx check green (fb-595.59)
</commit_message>
<xml_diff>
--- a/courts/first-circuit/bankruptcy-appellate-panel/reply-brief/docx/reference.docx
+++ b/courts/first-circuit/bankruptcy-appellate-panel/reply-brief/docx/reference.docx
@@ -74,10 +74,15 @@
         <w:footnoteRef/>
       </w:r>
       <w:r>
-        <w:t xml:space="preserve"> </w:t>
+        <w:t>Footnote Text.</w:t>
       </w:r>
+    </w:p>
+    <w:p>
+      <w:pPr>
+        <w:pStyle w:val="FootnoteBlockText"/>
+      </w:pPr>
       <w:r>
-        <w:t xml:space="preserve">Footnote Text.</w:t>
+        <w:t>Footnote Block Text</w:t>
       </w:r>
     </w:p>
   </w:footnote>
@@ -200,7 +205,7 @@
   <w:docDefaults>
     <w:rPrDefault>
       <w:rPr>
-        <w:rFonts w:ascii="EB Garamond" w:hAnsi="EB Garamond" w:eastAsia="EB Garamond" w:cs="EB Garamond"/>
+        <w:rFonts w:ascii="Liberation Serif" w:hAnsi="Liberation Serif" w:eastAsia="Liberation Serif" w:cs="Liberation Serif"/>
         <w:sz w:val="28"/>
         <w:szCs w:val="28"/>
         <w:lang w:val="en-US" w:eastAsia="en-US" w:bidi="ar-SA"/>
@@ -220,7 +225,7 @@
       <w:spacing w:before="0" w:after="0" w:line="445" w:lineRule="exact"/>
     </w:pPr>
     <w:rPr>
-      <w:rFonts w:ascii="EB Garamond" w:hAnsi="EB Garamond" w:eastAsia="EB Garamond" w:cs="EB Garamond"/>
+      <w:rFonts w:ascii="Liberation Serif" w:hAnsi="Liberation Serif" w:eastAsia="Liberation Serif" w:cs="Liberation Serif"/>
       <w:color w:val="000000"/>
       <w:sz w:val="28"/>
       <w:szCs w:val="28"/>
@@ -671,7 +676,7 @@
     </a:clrScheme>
     <a:fontScheme name="Office">
       <a:majorFont>
-        <a:latin typeface="EB Garamond" panose="02110004020202020204"/>
+        <a:latin typeface="Liberation Serif" panose="02110004020202020204"/>
         <a:ea typeface=""/>
         <a:cs typeface=""/>
         <a:font script="Jpan" typeface="游ゴシック Light"/>
@@ -723,7 +728,7 @@
         <a:font script="Tfng" typeface="Ebrima"/>
       </a:majorFont>
       <a:minorFont>
-        <a:latin typeface="EB Garamond" panose="02110004020202020204"/>
+        <a:latin typeface="Liberation Serif" panose="02110004020202020204"/>
         <a:ea typeface=""/>
         <a:cs typeface=""/>
         <a:font script="Jpan" typeface="游明朝"/>

</xml_diff>